<commit_message>
Ruling 43: a practice problem never repeats what the lesson already showed — Units 3 and 4 rewritten, rebuilt and installed at 0 findings (kit 050fc2b)
Co-Authored-By: Claude Opus 5.5 <noreply@anthropic.com>
Claude-Session: https://claude.ai/code/session_015xYWeLUsuszQH6z7ADE9tj
</commit_message>
<xml_diff>
--- a/a7/build/out/u3/A7 3.01 Product Laws of Exponents - Lesson Plan.docx
+++ b/a7/build/out/u3/A7 3.01 Product Laws of Exponents - Lesson Plan.docx
@@ -4321,7 +4321,7 @@
             <w:r>
               <w:drawing>
                 <wp:inline xmlns:a="http://schemas.openxmlformats.org/drawingml/2006/main" xmlns:pic="http://schemas.openxmlformats.org/drawingml/2006/picture">
-                  <wp:extent cx="417576" cy="170688"/>
+                  <wp:extent cx="499871" cy="170688"/>
                   <wp:docPr id="3" name="Picture 3"/>
                   <wp:cNvGraphicFramePr>
                     <a:graphicFrameLocks noChangeAspect="1"/>
@@ -4330,7 +4330,7 @@
                     <a:graphicData uri="http://schemas.openxmlformats.org/drawingml/2006/picture">
                       <pic:pic>
                         <pic:nvPicPr>
-                          <pic:cNvPr id="0" name="6bff253168f0d343.png"/>
+                          <pic:cNvPr id="0" name="d6ce281eb740aa63.png"/>
                           <pic:cNvPicPr/>
                         </pic:nvPicPr>
                         <pic:blipFill>
@@ -4342,7 +4342,7 @@
                         <pic:spPr>
                           <a:xfrm>
                             <a:off x="0" y="0"/>
-                            <a:ext cx="417576" cy="170688"/>
+                            <a:ext cx="499871" cy="170688"/>
                           </a:xfrm>
                           <a:prstGeom prst="rect"/>
                         </pic:spPr>
@@ -4381,7 +4381,7 @@
                 <w:color w:val="9E1B32"/>
                 <w:sz w:val="18"/>
               </w:rPr>
-              <w:t>1000</w:t>
+              <w:t>27,000</w:t>
             </w:r>
           </w:p>
         </w:tc>
@@ -4412,7 +4412,7 @@
                 <w:color w:val="1A1A1A"/>
                 <w:sz w:val="18"/>
               </w:rPr>
-              <w:t>30 — multiplied the base by the exponent [misconception: exponent treated as a factor]; 250 — applied the exponent to one factor only</w:t>
+              <w:t>90 — multiplied the base by the exponent [misconception: exponent treated as a factor]; 3,000 — applied the exponent to one factor only</w:t>
             </w:r>
           </w:p>
         </w:tc>
@@ -5413,7 +5413,7 @@
                 <w:color w:val="1A1A1A"/>
                 <w:sz w:val="18"/>
               </w:rPr>
-              <w:t>Aiyanna says she can use the power of a product law to evaluate (10 + (−2))</w:t>
+              <w:t>Aiyanna says she can use the power of a product law to evaluate (9 + (−3))</w:t>
             </w:r>
             <w:r>
               <w:rPr>
@@ -5463,7 +5463,7 @@
                 <w:color w:val="9E1B32"/>
                 <w:sz w:val="18"/>
               </w:rPr>
-              <w:t>No — (10 + (−2))</w:t>
+              <w:t>No — (9 + (−3))</w:t>
             </w:r>
             <w:r>
               <w:rPr>
@@ -5482,7 +5482,7 @@
                 <w:color w:val="9E1B32"/>
                 <w:sz w:val="18"/>
               </w:rPr>
-              <w:t xml:space="preserve"> = 8</w:t>
+              <w:t xml:space="preserve"> = 6</w:t>
             </w:r>
             <w:r>
               <w:rPr>
@@ -5501,7 +5501,7 @@
                 <w:color w:val="9E1B32"/>
                 <w:sz w:val="18"/>
               </w:rPr>
-              <w:t xml:space="preserve"> = 512</w:t>
+              <w:t xml:space="preserve"> = 216</w:t>
             </w:r>
           </w:p>
         </w:tc>
@@ -5532,7 +5532,7 @@
                 <w:color w:val="1A1A1A"/>
                 <w:sz w:val="18"/>
               </w:rPr>
-              <w:t>992 — distributed the exponent over the sum [7.NSO.1.1: the laws apply to products and quotients, never to sums]</w:t>
+              <w:t>702 — distributed the exponent over the sum [7.NSO.1.1: the laws apply to products and quotients, never to sums]</w:t>
             </w:r>
           </w:p>
         </w:tc>

</xml_diff>

<commit_message>
Ruling 43, second pass: 3.01 board 6, 3.T1 board 2, 3.T2 board 2 and independent 5, 4.02 board 9 get numbers of their own; Units 3 and 4 rebuilt at 0 findings
Co-Authored-By: Claude Opus 5.5 <noreply@anthropic.com>
Claude-Session: https://claude.ai/code/session_015xYWeLUsuszQH6z7ADE9tj
</commit_message>
<xml_diff>
--- a/a7/build/out/u3/A7 3.01 Product Laws of Exponents - Lesson Plan.docx
+++ b/a7/build/out/u3/A7 3.01 Product Laws of Exponents - Lesson Plan.docx
@@ -4865,7 +4865,7 @@
             <w:r>
               <w:drawing>
                 <wp:inline xmlns:a="http://schemas.openxmlformats.org/drawingml/2006/main" xmlns:pic="http://schemas.openxmlformats.org/drawingml/2006/picture">
-                  <wp:extent cx="310896" cy="170688"/>
+                  <wp:extent cx="307848" cy="170688"/>
                   <wp:docPr id="7" name="Picture 7"/>
                   <wp:cNvGraphicFramePr>
                     <a:graphicFrameLocks noChangeAspect="1"/>
@@ -4874,7 +4874,7 @@
                     <a:graphicData uri="http://schemas.openxmlformats.org/drawingml/2006/picture">
                       <pic:pic>
                         <pic:nvPicPr>
-                          <pic:cNvPr id="0" name="6f9a3780273f9463.png"/>
+                          <pic:cNvPr id="0" name="404475202a0a2e1e.png"/>
                           <pic:cNvPicPr/>
                         </pic:nvPicPr>
                         <pic:blipFill>
@@ -4886,7 +4886,7 @@
                         <pic:spPr>
                           <a:xfrm>
                             <a:off x="0" y="0"/>
-                            <a:ext cx="310896" cy="170688"/>
+                            <a:ext cx="307848" cy="170688"/>
                           </a:xfrm>
                           <a:prstGeom prst="rect"/>
                         </pic:spPr>
@@ -4944,7 +4944,7 @@
                 <w:sz w:val="18"/>
                 <w:vertAlign w:val="superscript"/>
               </w:rPr>
-              <w:t>6</w:t>
+              <w:t>12</w:t>
             </w:r>
           </w:p>
         </w:tc>
@@ -4975,7 +4975,7 @@
                 <w:color w:val="1A1A1A"/>
                 <w:sz w:val="18"/>
               </w:rPr>
-              <w:t>(A) added the exponents — the product-of-powers move applied to a power of a power [7.NSO.1.1 misconception, B1G-M]; (B) raised the base to the outer exponent as well [7.NSO.1.1 misconception: operating on the bases]; (D) raised the inner exponent to the outer one, 3</w:t>
+              <w:t>(A) added the exponents — the product-of-powers move applied to a power of a power [7.NSO.1.1 misconception, B1G-M]; (B) raised the base to the outer exponent as well [7.NSO.1.1 misconception: operating on the bases]; (D) raised the inner exponent to the outer one, 4</w:t>
             </w:r>
             <w:r>
               <w:rPr>
@@ -4985,7 +4985,7 @@
                 <w:sz w:val="18"/>
                 <w:vertAlign w:val="superscript"/>
               </w:rPr>
-              <w:t>2</w:t>
+              <w:t>3</w:t>
             </w:r>
             <w:r>
               <w:rPr>
@@ -4994,7 +4994,7 @@
                 <w:color w:val="1A1A1A"/>
                 <w:sz w:val="18"/>
               </w:rPr>
-              <w:t xml:space="preserve"> = 9 [misconception: the outer exponent applied to the exponent, not to the power]</w:t>
+              <w:t xml:space="preserve"> = 64 [misconception: the outer exponent applied to the exponent, not to the power]</w:t>
             </w:r>
           </w:p>
         </w:tc>

</xml_diff>